<commit_message>
Added VSL online appendix
</commit_message>
<xml_diff>
--- a/assets/Killeen-CV.docx
+++ b/assets/Killeen-CV.docx
@@ -1,6 +1,6 @@
 
 <file path=word/document.xml><?xml version="1.0" encoding="utf-8"?>
-<w:document xmlns:wpc="http://schemas.microsoft.com/office/word/2010/wordprocessingCanvas" xmlns:cx="http://schemas.microsoft.com/office/drawing/2014/chartex" xmlns:cx1="http://schemas.microsoft.com/office/drawing/2015/9/8/chartex" xmlns:cx2="http://schemas.microsoft.com/office/drawing/2015/10/21/chartex" xmlns:cx3="http://schemas.microsoft.com/office/drawing/2016/5/9/chartex" xmlns:cx4="http://schemas.microsoft.com/office/drawing/2016/5/10/chartex" xmlns:cx5="http://schemas.microsoft.com/office/drawing/2016/5/11/chartex" xmlns:cx6="http://schemas.microsoft.com/office/drawing/2016/5/12/chartex" xmlns:cx7="http://schemas.microsoft.com/office/drawing/2016/5/13/chartex" xmlns:cx8="http://schemas.microsoft.com/office/drawing/2016/5/14/chartex" xmlns:mc="http://schemas.openxmlformats.org/markup-compatibility/2006" xmlns:aink="http://schemas.microsoft.com/office/drawing/2016/ink" xmlns:am3d="http://schemas.microsoft.com/office/drawing/2017/model3d" xmlns:o="urn:schemas-microsoft-com:office:office" xmlns:oel="http://schemas.microsoft.com/office/2019/extlst" xmlns:r="http://schemas.openxmlformats.org/officeDocument/2006/relationships" xmlns:m="http://schemas.openxmlformats.org/officeDocument/2006/math" xmlns:v="urn:schemas-microsoft-com:vml" xmlns:wp14="http://schemas.microsoft.com/office/word/2010/wordprocessingDrawing" xmlns:wp="http://schemas.openxmlformats.org/drawingml/2006/wordprocessingDrawing" xmlns:w10="urn:schemas-microsoft-com:office:word" xmlns:w="http://schemas.openxmlformats.org/wordprocessingml/2006/main" xmlns:w14="http://schemas.microsoft.com/office/word/2010/wordml" xmlns:w15="http://schemas.microsoft.com/office/word/2012/wordml" xmlns:w16cex="http://schemas.microsoft.com/office/word/2018/wordml/cex" xmlns:w16cid="http://schemas.microsoft.com/office/word/2016/wordml/cid" xmlns:w16="http://schemas.microsoft.com/office/word/2018/wordml" xmlns:w16du="http://schemas.microsoft.com/office/word/2023/wordml/word16du" xmlns:w16sdtdh="http://schemas.microsoft.com/office/word/2020/wordml/sdtdatahash" xmlns:w16sdtfl="http://schemas.microsoft.com/office/word/2024/wordml/sdtformatlock" xmlns:w16se="http://schemas.microsoft.com/office/word/2015/wordml/symex" xmlns:wpg="http://schemas.microsoft.com/office/word/2010/wordprocessingGroup" xmlns:wpi="http://schemas.microsoft.com/office/word/2010/wordprocessingInk" xmlns:wne="http://schemas.microsoft.com/office/word/2006/wordml" xmlns:wps="http://schemas.microsoft.com/office/word/2010/wordprocessingShape" mc:Ignorable="w14 w15 w16se w16cid w16 w16cex w16sdtdh w16sdtfl w16du wp14">
+<w:document xmlns:wpc="http://schemas.microsoft.com/office/word/2010/wordprocessingCanvas" xmlns:cx="http://schemas.microsoft.com/office/drawing/2014/chartex" xmlns:cx1="http://schemas.microsoft.com/office/drawing/2015/9/8/chartex" xmlns:cx2="http://schemas.microsoft.com/office/drawing/2015/10/21/chartex" xmlns:cx3="http://schemas.microsoft.com/office/drawing/2016/5/9/chartex" xmlns:cx4="http://schemas.microsoft.com/office/drawing/2016/5/10/chartex" xmlns:cx5="http://schemas.microsoft.com/office/drawing/2016/5/11/chartex" xmlns:cx6="http://schemas.microsoft.com/office/drawing/2016/5/12/chartex" xmlns:cx7="http://schemas.microsoft.com/office/drawing/2016/5/13/chartex" xmlns:cx8="http://schemas.microsoft.com/office/drawing/2016/5/14/chartex" xmlns:mc="http://schemas.openxmlformats.org/markup-compatibility/2006" xmlns:m="http://schemas.openxmlformats.org/officeDocument/2006/math" xmlns:aink="http://schemas.microsoft.com/office/drawing/2016/ink" xmlns:am3d="http://schemas.microsoft.com/office/drawing/2017/model3d" xmlns:oel="http://schemas.microsoft.com/office/2019/extlst" xmlns:r="http://schemas.openxmlformats.org/officeDocument/2006/relationships" xmlns:wp14="http://schemas.microsoft.com/office/word/2010/wordprocessingDrawing" xmlns:wp="http://schemas.openxmlformats.org/drawingml/2006/wordprocessingDrawing" xmlns:wpg="http://schemas.microsoft.com/office/word/2010/wordprocessingGroup" xmlns:wpi="http://schemas.microsoft.com/office/word/2010/wordprocessingInk" xmlns:wps="http://schemas.microsoft.com/office/word/2010/wordprocessingShape" xmlns:o="urn:schemas-microsoft-com:office:office" xmlns:v="urn:schemas-microsoft-com:vml" xmlns:w10="urn:schemas-microsoft-com:office:word" xmlns:w="http://schemas.openxmlformats.org/wordprocessingml/2006/main" xmlns:w14="http://schemas.microsoft.com/office/word/2010/wordml" xmlns:w15="http://schemas.microsoft.com/office/word/2012/wordml" xmlns:w16cei="http://schemas.microsoft.com/office/word/2026/wordml/cei" xmlns:w16cex="http://schemas.microsoft.com/office/word/2018/wordml/cex" xmlns:w16cid="http://schemas.microsoft.com/office/word/2016/wordml/cid" xmlns:w16="http://schemas.microsoft.com/office/word/2018/wordml" xmlns:w16sdtdh="http://schemas.microsoft.com/office/word/2020/wordml/sdtdatahash" xmlns:w16sdtfl="http://schemas.microsoft.com/office/word/2024/wordml/sdtformatlock" xmlns:w16se="http://schemas.microsoft.com/office/word/2015/wordml/symex" xmlns:w16du="http://schemas.microsoft.com/office/word/2023/wordml/word16du" xmlns:wne="http://schemas.microsoft.com/office/word/2006/wordml" mc:Ignorable="w14 w15 w16se w16cid w16 w16cex w16sdtdh w16sdtfl w16du wp14">
   <w:body>
     <w:p>
       <w:pPr>
@@ -238,7 +238,36 @@
           <w:sz w:val="20"/>
           <w:szCs w:val="20"/>
         </w:rPr>
-        <w:t>530 Evans Hall, #3880</w:t>
+        <w:t>1126 E 59</w:t>
+      </w:r>
+      <w:r>
+        <w:rPr>
+          <w:sz w:val="20"/>
+          <w:szCs w:val="20"/>
+          <w:vertAlign w:val="superscript"/>
+        </w:rPr>
+        <w:t>th</w:t>
+      </w:r>
+      <w:r>
+        <w:rPr>
+          <w:sz w:val="20"/>
+          <w:szCs w:val="20"/>
+        </w:rPr>
+        <w:t xml:space="preserve"> Street</w:t>
+      </w:r>
+      <w:r>
+        <w:rPr>
+          <w:sz w:val="20"/>
+          <w:szCs w:val="20"/>
+        </w:rPr>
+        <w:t>, #</w:t>
+      </w:r>
+      <w:r>
+        <w:rPr>
+          <w:sz w:val="20"/>
+          <w:szCs w:val="20"/>
+        </w:rPr>
+        <w:t>318</w:t>
       </w:r>
     </w:p>
     <w:p>
@@ -266,7 +295,35 @@
           <w:sz w:val="20"/>
           <w:szCs w:val="20"/>
         </w:rPr>
-        <w:t>Berkeley, CA 94720-3880</w:t>
+        <w:t>Chicago</w:t>
+      </w:r>
+      <w:r>
+        <w:rPr>
+          <w:sz w:val="20"/>
+          <w:szCs w:val="20"/>
+        </w:rPr>
+        <w:t xml:space="preserve">, </w:t>
+      </w:r>
+      <w:r>
+        <w:rPr>
+          <w:sz w:val="20"/>
+          <w:szCs w:val="20"/>
+        </w:rPr>
+        <w:t>IL</w:t>
+      </w:r>
+      <w:r>
+        <w:rPr>
+          <w:sz w:val="20"/>
+          <w:szCs w:val="20"/>
+        </w:rPr>
+        <w:t xml:space="preserve"> </w:t>
+      </w:r>
+      <w:r>
+        <w:rPr>
+          <w:sz w:val="20"/>
+          <w:szCs w:val="20"/>
+        </w:rPr>
+        <w:t>60637</w:t>
       </w:r>
     </w:p>
     <w:p>
@@ -468,7 +525,7 @@
           <w:sz w:val="18"/>
           <w:szCs w:val="18"/>
         </w:rPr>
-        <w:t xml:space="preserve">Assistant Professor </w:t>
+        <w:t>Assistant Professor</w:t>
       </w:r>
       <w:r>
         <w:rPr>
@@ -477,6 +534,24 @@
           <w:sz w:val="18"/>
           <w:szCs w:val="18"/>
         </w:rPr>
+        <w:t xml:space="preserve"> (starting July 2027)</w:t>
+      </w:r>
+      <w:r>
+        <w:rPr>
+          <w:i/>
+          <w:iCs/>
+          <w:sz w:val="18"/>
+          <w:szCs w:val="18"/>
+        </w:rPr>
+        <w:t xml:space="preserve"> </w:t>
+      </w:r>
+      <w:r>
+        <w:rPr>
+          <w:i/>
+          <w:iCs/>
+          <w:sz w:val="18"/>
+          <w:szCs w:val="18"/>
+        </w:rPr>
         <w:tab/>
         <w:t xml:space="preserve">2027 – </w:t>
       </w:r>
@@ -1523,7 +1598,55 @@
           <w:sz w:val="20"/>
           <w:szCs w:val="20"/>
         </w:rPr>
-        <w:t>Luisa Cefala, Rédempteur Ntawiratsa and Nicholas Swanson</w:t>
+        <w:t xml:space="preserve">Luisa </w:t>
+      </w:r>
+      <w:proofErr w:type="spellStart"/>
+      <w:r>
+        <w:rPr>
+          <w:sz w:val="20"/>
+          <w:szCs w:val="20"/>
+        </w:rPr>
+        <w:t>Cefala</w:t>
+      </w:r>
+      <w:proofErr w:type="spellEnd"/>
+      <w:r>
+        <w:rPr>
+          <w:sz w:val="20"/>
+          <w:szCs w:val="20"/>
+        </w:rPr>
+        <w:t xml:space="preserve">, </w:t>
+      </w:r>
+      <w:proofErr w:type="spellStart"/>
+      <w:r>
+        <w:rPr>
+          <w:sz w:val="20"/>
+          <w:szCs w:val="20"/>
+        </w:rPr>
+        <w:t>Rédempteur</w:t>
+      </w:r>
+      <w:proofErr w:type="spellEnd"/>
+      <w:r>
+        <w:rPr>
+          <w:sz w:val="20"/>
+          <w:szCs w:val="20"/>
+        </w:rPr>
+        <w:t xml:space="preserve"> </w:t>
+      </w:r>
+      <w:proofErr w:type="spellStart"/>
+      <w:r>
+        <w:rPr>
+          <w:sz w:val="20"/>
+          <w:szCs w:val="20"/>
+        </w:rPr>
+        <w:t>Ntawiratsa</w:t>
+      </w:r>
+      <w:proofErr w:type="spellEnd"/>
+      <w:r>
+        <w:rPr>
+          <w:sz w:val="20"/>
+          <w:szCs w:val="20"/>
+        </w:rPr>
+        <w:t xml:space="preserve"> and Nicholas Swanson</w:t>
       </w:r>
       <w:r>
         <w:rPr>
@@ -1701,7 +1824,39 @@
           <w:szCs w:val="20"/>
         </w:rPr>
         <w:tab/>
-        <w:t xml:space="preserve">Private Enterprise Development in Low Income Countries ($42,000) – Scale up grant (with  Luisa Cefala and Nicholas Swanson) </w:t>
+        <w:t>Private Enterprise Development in Low Income Countries ($42,000) – Scale up grant (</w:t>
+      </w:r>
+      <w:proofErr w:type="gramStart"/>
+      <w:r>
+        <w:rPr>
+          <w:sz w:val="20"/>
+          <w:szCs w:val="20"/>
+        </w:rPr>
+        <w:t>with  Luisa</w:t>
+      </w:r>
+      <w:proofErr w:type="gramEnd"/>
+      <w:r>
+        <w:rPr>
+          <w:sz w:val="20"/>
+          <w:szCs w:val="20"/>
+        </w:rPr>
+        <w:t xml:space="preserve"> </w:t>
+      </w:r>
+      <w:proofErr w:type="spellStart"/>
+      <w:r>
+        <w:rPr>
+          <w:sz w:val="20"/>
+          <w:szCs w:val="20"/>
+        </w:rPr>
+        <w:t>Cefala</w:t>
+      </w:r>
+      <w:proofErr w:type="spellEnd"/>
+      <w:r>
+        <w:rPr>
+          <w:sz w:val="20"/>
+          <w:szCs w:val="20"/>
+        </w:rPr>
+        <w:t xml:space="preserve"> and Nicholas Swanson) </w:t>
       </w:r>
       <w:r>
         <w:rPr>
@@ -1800,7 +1955,23 @@
           <w:szCs w:val="20"/>
         </w:rPr>
         <w:tab/>
-        <w:t xml:space="preserve">Private Enterprise Development in Low Income Countries ($40,000) – Grant to study competition (with Luisa Cefala and Nicholas Swanson) </w:t>
+        <w:t xml:space="preserve">Private Enterprise Development in Low Income Countries ($40,000) – Grant to study competition (with Luisa </w:t>
+      </w:r>
+      <w:proofErr w:type="spellStart"/>
+      <w:r>
+        <w:rPr>
+          <w:sz w:val="20"/>
+          <w:szCs w:val="20"/>
+        </w:rPr>
+        <w:t>Cefala</w:t>
+      </w:r>
+      <w:proofErr w:type="spellEnd"/>
+      <w:r>
+        <w:rPr>
+          <w:sz w:val="20"/>
+          <w:szCs w:val="20"/>
+        </w:rPr>
+        <w:t xml:space="preserve"> and Nicholas Swanson) </w:t>
       </w:r>
     </w:p>
     <w:p>
@@ -2119,7 +2290,23 @@
           <w:sz w:val="20"/>
           <w:szCs w:val="20"/>
         </w:rPr>
-        <w:t>, Development Rookiefest (Northwestern)</w:t>
+        <w:t xml:space="preserve">, Development </w:t>
+      </w:r>
+      <w:proofErr w:type="spellStart"/>
+      <w:r>
+        <w:rPr>
+          <w:sz w:val="20"/>
+          <w:szCs w:val="20"/>
+        </w:rPr>
+        <w:t>Rookiefest</w:t>
+      </w:r>
+      <w:proofErr w:type="spellEnd"/>
+      <w:r>
+        <w:rPr>
+          <w:sz w:val="20"/>
+          <w:szCs w:val="20"/>
+        </w:rPr>
+        <w:t xml:space="preserve"> (Northwestern)</w:t>
       </w:r>
       <w:r>
         <w:rPr>
@@ -2908,7 +3095,7 @@
 </file>
 
 <file path=word/numbering.xml><?xml version="1.0" encoding="utf-8"?>
-<w:numbering xmlns:wpc="http://schemas.microsoft.com/office/word/2010/wordprocessingCanvas" xmlns:cx="http://schemas.microsoft.com/office/drawing/2014/chartex" xmlns:cx1="http://schemas.microsoft.com/office/drawing/2015/9/8/chartex" xmlns:cx2="http://schemas.microsoft.com/office/drawing/2015/10/21/chartex" xmlns:cx3="http://schemas.microsoft.com/office/drawing/2016/5/9/chartex" xmlns:cx4="http://schemas.microsoft.com/office/drawing/2016/5/10/chartex" xmlns:cx5="http://schemas.microsoft.com/office/drawing/2016/5/11/chartex" xmlns:cx6="http://schemas.microsoft.com/office/drawing/2016/5/12/chartex" xmlns:cx7="http://schemas.microsoft.com/office/drawing/2016/5/13/chartex" xmlns:cx8="http://schemas.microsoft.com/office/drawing/2016/5/14/chartex" xmlns:mc="http://schemas.openxmlformats.org/markup-compatibility/2006" xmlns:aink="http://schemas.microsoft.com/office/drawing/2016/ink" xmlns:am3d="http://schemas.microsoft.com/office/drawing/2017/model3d" xmlns:o="urn:schemas-microsoft-com:office:office" xmlns:oel="http://schemas.microsoft.com/office/2019/extlst" xmlns:r="http://schemas.openxmlformats.org/officeDocument/2006/relationships" xmlns:m="http://schemas.openxmlformats.org/officeDocument/2006/math" xmlns:v="urn:schemas-microsoft-com:vml" xmlns:wp14="http://schemas.microsoft.com/office/word/2010/wordprocessingDrawing" xmlns:wp="http://schemas.openxmlformats.org/drawingml/2006/wordprocessingDrawing" xmlns:w10="urn:schemas-microsoft-com:office:word" xmlns:w="http://schemas.openxmlformats.org/wordprocessingml/2006/main" xmlns:w14="http://schemas.microsoft.com/office/word/2010/wordml" xmlns:w15="http://schemas.microsoft.com/office/word/2012/wordml" xmlns:w16cex="http://schemas.microsoft.com/office/word/2018/wordml/cex" xmlns:w16cid="http://schemas.microsoft.com/office/word/2016/wordml/cid" xmlns:w16="http://schemas.microsoft.com/office/word/2018/wordml" xmlns:w16du="http://schemas.microsoft.com/office/word/2023/wordml/word16du" xmlns:w16sdtdh="http://schemas.microsoft.com/office/word/2020/wordml/sdtdatahash" xmlns:w16sdtfl="http://schemas.microsoft.com/office/word/2024/wordml/sdtformatlock" xmlns:w16se="http://schemas.microsoft.com/office/word/2015/wordml/symex" xmlns:wpg="http://schemas.microsoft.com/office/word/2010/wordprocessingGroup" xmlns:wpi="http://schemas.microsoft.com/office/word/2010/wordprocessingInk" xmlns:wne="http://schemas.microsoft.com/office/word/2006/wordml" xmlns:wps="http://schemas.microsoft.com/office/word/2010/wordprocessingShape" mc:Ignorable="w14 w15 w16se w16cid w16 w16cex w16sdtdh w16sdtfl w16du wp14">
+<w:numbering xmlns:wpc="http://schemas.microsoft.com/office/word/2010/wordprocessingCanvas" xmlns:cx="http://schemas.microsoft.com/office/drawing/2014/chartex" xmlns:cx1="http://schemas.microsoft.com/office/drawing/2015/9/8/chartex" xmlns:cx2="http://schemas.microsoft.com/office/drawing/2015/10/21/chartex" xmlns:cx3="http://schemas.microsoft.com/office/drawing/2016/5/9/chartex" xmlns:cx4="http://schemas.microsoft.com/office/drawing/2016/5/10/chartex" xmlns:cx5="http://schemas.microsoft.com/office/drawing/2016/5/11/chartex" xmlns:cx6="http://schemas.microsoft.com/office/drawing/2016/5/12/chartex" xmlns:cx7="http://schemas.microsoft.com/office/drawing/2016/5/13/chartex" xmlns:cx8="http://schemas.microsoft.com/office/drawing/2016/5/14/chartex" xmlns:mc="http://schemas.openxmlformats.org/markup-compatibility/2006" xmlns:m="http://schemas.openxmlformats.org/officeDocument/2006/math" xmlns:aink="http://schemas.microsoft.com/office/drawing/2016/ink" xmlns:am3d="http://schemas.microsoft.com/office/drawing/2017/model3d" xmlns:oel="http://schemas.microsoft.com/office/2019/extlst" xmlns:r="http://schemas.openxmlformats.org/officeDocument/2006/relationships" xmlns:wp14="http://schemas.microsoft.com/office/word/2010/wordprocessingDrawing" xmlns:wp="http://schemas.openxmlformats.org/drawingml/2006/wordprocessingDrawing" xmlns:wpg="http://schemas.microsoft.com/office/word/2010/wordprocessingGroup" xmlns:wpi="http://schemas.microsoft.com/office/word/2010/wordprocessingInk" xmlns:wps="http://schemas.microsoft.com/office/word/2010/wordprocessingShape" xmlns:o="urn:schemas-microsoft-com:office:office" xmlns:v="urn:schemas-microsoft-com:vml" xmlns:w10="urn:schemas-microsoft-com:office:word" xmlns:w="http://schemas.openxmlformats.org/wordprocessingml/2006/main" xmlns:w14="http://schemas.microsoft.com/office/word/2010/wordml" xmlns:w15="http://schemas.microsoft.com/office/word/2012/wordml" xmlns:w16cei="http://schemas.microsoft.com/office/word/2026/wordml/cei" xmlns:w16cex="http://schemas.microsoft.com/office/word/2018/wordml/cex" xmlns:w16cid="http://schemas.microsoft.com/office/word/2016/wordml/cid" xmlns:w16="http://schemas.microsoft.com/office/word/2018/wordml" xmlns:w16sdtdh="http://schemas.microsoft.com/office/word/2020/wordml/sdtdatahash" xmlns:w16sdtfl="http://schemas.microsoft.com/office/word/2024/wordml/sdtformatlock" xmlns:w16se="http://schemas.microsoft.com/office/word/2015/wordml/symex" xmlns:w16du="http://schemas.microsoft.com/office/word/2023/wordml/word16du" xmlns:wne="http://schemas.microsoft.com/office/word/2006/wordml" mc:Ignorable="w14 w15 w16se w16cid w16 w16cex w16sdtdh w16sdtfl w16du wp14">
   <w:abstractNum w:abstractNumId="0" w15:restartNumberingAfterBreak="0">
     <w:nsid w:val="0976329A"/>
     <w:multiLevelType w:val="multilevel"/>
@@ -3029,7 +3216,7 @@
 </file>
 
 <file path=word/styles.xml><?xml version="1.0" encoding="utf-8"?>
-<w:styles xmlns:mc="http://schemas.openxmlformats.org/markup-compatibility/2006" xmlns:r="http://schemas.openxmlformats.org/officeDocument/2006/relationships" xmlns:w="http://schemas.openxmlformats.org/wordprocessingml/2006/main" xmlns:w14="http://schemas.microsoft.com/office/word/2010/wordml" xmlns:w15="http://schemas.microsoft.com/office/word/2012/wordml" xmlns:w16cex="http://schemas.microsoft.com/office/word/2018/wordml/cex" xmlns:w16cid="http://schemas.microsoft.com/office/word/2016/wordml/cid" xmlns:w16="http://schemas.microsoft.com/office/word/2018/wordml" xmlns:w16du="http://schemas.microsoft.com/office/word/2023/wordml/word16du" xmlns:w16sdtdh="http://schemas.microsoft.com/office/word/2020/wordml/sdtdatahash" xmlns:w16sdtfl="http://schemas.microsoft.com/office/word/2024/wordml/sdtformatlock" xmlns:w16se="http://schemas.microsoft.com/office/word/2015/wordml/symex" mc:Ignorable="w14 w15 w16se w16cid w16 w16cex w16sdtdh w16sdtfl w16du">
+<w:styles xmlns:mc="http://schemas.openxmlformats.org/markup-compatibility/2006" xmlns:r="http://schemas.openxmlformats.org/officeDocument/2006/relationships" xmlns:w="http://schemas.openxmlformats.org/wordprocessingml/2006/main" xmlns:w14="http://schemas.microsoft.com/office/word/2010/wordml" xmlns:w15="http://schemas.microsoft.com/office/word/2012/wordml" xmlns:w16cex="http://schemas.microsoft.com/office/word/2018/wordml/cex" xmlns:w16cid="http://schemas.microsoft.com/office/word/2016/wordml/cid" xmlns:w16="http://schemas.microsoft.com/office/word/2018/wordml" xmlns:w16sdtdh="http://schemas.microsoft.com/office/word/2020/wordml/sdtdatahash" xmlns:w16sdtfl="http://schemas.microsoft.com/office/word/2024/wordml/sdtformatlock" xmlns:w16se="http://schemas.microsoft.com/office/word/2015/wordml/symex" xmlns:w16du="http://schemas.microsoft.com/office/word/2023/wordml/word16du" mc:Ignorable="w14 w15 w16se w16cid w16 w16cex w16sdtdh w16sdtfl w16du">
   <w:docDefaults>
     <w:rPrDefault>
       <w:rPr>

</xml_diff>